<commit_message>
Willis Temby: Part A and Part B pre-kick-off questionnaires
Forms built from the Master Doc gaps (10 fields), with question numbers
written back into master-doc.json. Kick-off brief and docx rebuilt.

Co-Authored-By: Claude Opus 5.5 <noreply@anthropic.com>
Claude-Session: https://claude.ai/code/session_01MFMqg6zWXi6LFjkEQdnHcM
</commit_message>
<xml_diff>
--- a/Willis Temby - Master Doc Brief.docx
+++ b/Willis Temby - Master Doc Brief.docx
@@ -551,6 +551,160 @@
           </w:p>
         </w:tc>
       </w:tr>
+      <w:tr>
+        <w:trPr>
+          <w:cantSplit w:val="0"/>
+          <w:tblHeader w:val="0"/>
+        </w:trPr>
+        <w:tc>
+          <w:tcPr>
+            <w:tcBorders>
+              <w:top w:color="d5d8e2" w:space="0" w:sz="6" w:val="single"/>
+              <w:left w:color="d5d8e2" w:space="0" w:sz="6" w:val="single"/>
+              <w:bottom w:color="d5d8e2" w:space="0" w:sz="6" w:val="single"/>
+              <w:right w:color="d5d8e2" w:space="0" w:sz="6" w:val="single"/>
+            </w:tcBorders>
+            <w:shd w:fill="auto" w:val="clear"/>
+            <w:tcMar>
+              <w:top w:w="105.0" w:type="dxa"/>
+              <w:left w:w="150.0" w:type="dxa"/>
+              <w:bottom w:w="105.0" w:type="dxa"/>
+              <w:right w:w="150.0" w:type="dxa"/>
+            </w:tcMar>
+            <w:vAlign w:val="top"/>
+          </w:tcPr>
+          <w:p>
+            <w:pPr>
+              <w:widowControl w:val="0"/>
+              <w:spacing w:after="105" w:before="105" w:line="360" w:lineRule="auto"/>
+              <w:rPr>
+                <w:color w:val="2b2b36"/>
+                <w:sz w:val="20"/>
+                <w:szCs w:val="20"/>
+              </w:rPr>
+            </w:pPr>
+            <w:r>
+              <w:rPr>
+                <w:color w:val="2B2B36"/>
+                <w:sz w:val="20"/>
+              </w:rPr>
+              <w:t>v0.1</w:t>
+            </w:r>
+          </w:p>
+        </w:tc>
+        <w:tc>
+          <w:tcPr>
+            <w:tcBorders>
+              <w:top w:color="d5d8e2" w:space="0" w:sz="6" w:val="single"/>
+              <w:left w:color="d5d8e2" w:space="0" w:sz="6" w:val="single"/>
+              <w:bottom w:color="d5d8e2" w:space="0" w:sz="6" w:val="single"/>
+              <w:right w:color="d5d8e2" w:space="0" w:sz="6" w:val="single"/>
+            </w:tcBorders>
+            <w:shd w:fill="auto" w:val="clear"/>
+            <w:tcMar>
+              <w:top w:w="105.0" w:type="dxa"/>
+              <w:left w:w="150.0" w:type="dxa"/>
+              <w:bottom w:w="105.0" w:type="dxa"/>
+              <w:right w:w="150.0" w:type="dxa"/>
+            </w:tcMar>
+            <w:vAlign w:val="top"/>
+          </w:tcPr>
+          <w:p>
+            <w:pPr>
+              <w:widowControl w:val="0"/>
+              <w:spacing w:after="105" w:before="105" w:line="360" w:lineRule="auto"/>
+              <w:rPr>
+                <w:i w:val="1"/>
+                <w:iCs w:val="1"/>
+                <w:color w:val="8a8fa3"/>
+                <w:sz w:val="20"/>
+                <w:szCs w:val="20"/>
+              </w:rPr>
+            </w:pPr>
+            <w:r>
+              <w:rPr>
+                <w:color w:val="2B2B36"/>
+                <w:sz w:val="20"/>
+              </w:rPr>
+              <w:t>26/10/2026</w:t>
+            </w:r>
+          </w:p>
+        </w:tc>
+        <w:tc>
+          <w:tcPr>
+            <w:tcBorders>
+              <w:top w:color="d5d8e2" w:space="0" w:sz="6" w:val="single"/>
+              <w:left w:color="d5d8e2" w:space="0" w:sz="6" w:val="single"/>
+              <w:bottom w:color="d5d8e2" w:space="0" w:sz="6" w:val="single"/>
+              <w:right w:color="d5d8e2" w:space="0" w:sz="6" w:val="single"/>
+            </w:tcBorders>
+            <w:shd w:fill="auto" w:val="clear"/>
+            <w:tcMar>
+              <w:top w:w="105.0" w:type="dxa"/>
+              <w:left w:w="150.0" w:type="dxa"/>
+              <w:bottom w:w="105.0" w:type="dxa"/>
+              <w:right w:w="150.0" w:type="dxa"/>
+            </w:tcMar>
+            <w:vAlign w:val="top"/>
+          </w:tcPr>
+          <w:p>
+            <w:pPr>
+              <w:widowControl w:val="0"/>
+              <w:spacing w:after="105" w:before="105" w:line="360" w:lineRule="auto"/>
+              <w:rPr>
+                <w:i w:val="1"/>
+                <w:iCs w:val="1"/>
+                <w:color w:val="8a8fa3"/>
+                <w:sz w:val="20"/>
+                <w:szCs w:val="20"/>
+              </w:rPr>
+            </w:pPr>
+            <w:r>
+              <w:rPr>
+                <w:color w:val="2B2B36"/>
+                <w:sz w:val="20"/>
+              </w:rPr>
+              <w:t>Gabe Silva</w:t>
+            </w:r>
+          </w:p>
+        </w:tc>
+        <w:tc>
+          <w:tcPr>
+            <w:tcBorders>
+              <w:top w:color="d5d8e2" w:space="0" w:sz="6" w:val="single"/>
+              <w:left w:color="d5d8e2" w:space="0" w:sz="6" w:val="single"/>
+              <w:bottom w:color="d5d8e2" w:space="0" w:sz="6" w:val="single"/>
+              <w:right w:color="d5d8e2" w:space="0" w:sz="6" w:val="single"/>
+            </w:tcBorders>
+            <w:shd w:fill="auto" w:val="clear"/>
+            <w:tcMar>
+              <w:top w:w="105.0" w:type="dxa"/>
+              <w:left w:w="150.0" w:type="dxa"/>
+              <w:bottom w:w="105.0" w:type="dxa"/>
+              <w:right w:w="150.0" w:type="dxa"/>
+            </w:tcMar>
+            <w:vAlign w:val="top"/>
+          </w:tcPr>
+          <w:p>
+            <w:pPr>
+              <w:widowControl w:val="0"/>
+              <w:spacing w:after="105" w:before="105" w:line="360" w:lineRule="auto"/>
+              <w:rPr>
+                <w:color w:val="2b2b36"/>
+                <w:sz w:val="20"/>
+                <w:szCs w:val="20"/>
+              </w:rPr>
+            </w:pPr>
+            <w:r>
+              <w:rPr>
+                <w:color w:val="2B2B36"/>
+                <w:sz w:val="20"/>
+              </w:rPr>
+              <w:t>Part A and Part B questionnaires drafted; 10 fields routed to the forms</w:t>
+            </w:r>
+          </w:p>
+        </w:tc>
+      </w:tr>
     </w:tbl>
     <w:p>
       <w:pPr>
@@ -3774,7 +3928,7 @@
                 <w:color w:val="C0392B"/>
                 <w:sz w:val="20"/>
               </w:rPr>
-              <w:t xml:space="preserve"> TBC: ask at kick-off</w:t>
+              <w:t xml:space="preserve"> TBC: questionnaire Part A Q7, Q8</w:t>
             </w:r>
             <w:r>
               <w:rPr>
@@ -5218,7 +5372,7 @@
                 <w:color w:val="C0392B"/>
                 <w:sz w:val="20"/>
               </w:rPr>
-              <w:t xml:space="preserve"> TBC: ask at kick-off</w:t>
+              <w:t xml:space="preserve"> TBC: questionnaire Part B QB5</w:t>
             </w:r>
           </w:p>
         </w:tc>
@@ -8413,7 +8567,7 @@
                 <w:color w:val="C0392B"/>
                 <w:sz w:val="20"/>
               </w:rPr>
-              <w:t xml:space="preserve"> TBC: ask at kick-off</w:t>
+              <w:t xml:space="preserve"> TBC: questionnaire Part A Q5</w:t>
             </w:r>
             <w:r>
               <w:rPr>
@@ -8605,7 +8759,7 @@
                 <w:color w:val="C0392B"/>
                 <w:sz w:val="20"/>
               </w:rPr>
-              <w:t xml:space="preserve"> TBC: ask at kick-off</w:t>
+              <w:t xml:space="preserve"> TBC: questionnaire Part A Q6</w:t>
             </w:r>
             <w:r>
               <w:rPr>
@@ -9037,7 +9191,7 @@
                 <w:color w:val="C0392B"/>
                 <w:sz w:val="20"/>
               </w:rPr>
-              <w:t xml:space="preserve"> TBC: internal. Contested: Quote: 12 industry verticals and 13 policy/product lines [E]. Client's new sitemap: about 109 pages [D], about 125 [H]. Client signed with 'discussions on new site map will overrule that listed within contract' [E]. Handover says proceed on the new sitemap [H]. Pages are fine if served by the quoted templates; extra templates are not.</w:t>
+              <w:t xml:space="preserve"> TBC: questionnaire Part A Q1, Q2. Contested: Quote: 12 industry verticals and 13 policy/product lines [E]. Client's new sitemap: about 109 pages [D], about 125 [H]. Client signed with 'discussions on new site map will overrule that listed within contract' [E]. Handover says proceed on the new sitemap [H]. Pages are fine if served by the quoted templates; extra templates are not.</w:t>
             </w:r>
             <w:r>
               <w:rPr>
@@ -18118,7 +18272,7 @@
                 <w:color w:val="C0392B"/>
                 <w:sz w:val="20"/>
               </w:rPr>
-              <w:t xml:space="preserve"> TBC: ask at kick-off. Contested: Quote: outbound link to DEFT (Macquarie), no gateway [E,H]. Client on 21/07: Macquarie may change, Stripe 'back on the table' [T 26:24]. Mia said devs would integrate it [T 27:16]. A Stripe integration is not quoted.</w:t>
+              <w:t xml:space="preserve"> TBC: questionnaire Part B QB1, QB6. Contested: Quote: outbound link to DEFT (Macquarie), no gateway [E,H]. Client on 21/07: Macquarie may change, Stripe 'back on the table' [T 26:24]. Mia said devs would integrate it [T 27:16]. A Stripe integration is not quoted.</w:t>
             </w:r>
             <w:r>
               <w:rPr>
@@ -18224,7 +18378,7 @@
                 <w:color w:val="C0392B"/>
                 <w:sz w:val="20"/>
               </w:rPr>
-              <w:t xml:space="preserve"> TBC: ask at kick-off</w:t>
+              <w:t xml:space="preserve"> TBC: questionnaire Part B QB2, QB3, QB4</w:t>
             </w:r>
             <w:r>
               <w:rPr>
@@ -18519,7 +18673,7 @@
                 <w:color w:val="C0392B"/>
                 <w:sz w:val="20"/>
               </w:rPr>
-              <w:t xml:space="preserve"> TBC: ask at kick-off</w:t>
+              <w:t xml:space="preserve"> TBC: questionnaire Part B QB5</w:t>
             </w:r>
             <w:r>
               <w:rPr>
@@ -18967,7 +19121,7 @@
                 <w:color w:val="C0392B"/>
                 <w:sz w:val="20"/>
               </w:rPr>
-              <w:t xml:space="preserve"> TBC: ask at kick-off</w:t>
+              <w:t xml:space="preserve"> TBC: questionnaire Part A Q3</w:t>
             </w:r>
             <w:r>
               <w:rPr>
@@ -19161,7 +19315,7 @@
                 <w:color w:val="C0392B"/>
                 <w:sz w:val="20"/>
               </w:rPr>
-              <w:t xml:space="preserve"> TBC: ask at kick-off</w:t>
+              <w:t xml:space="preserve"> TBC: questionnaire Part A Q4</w:t>
             </w:r>
             <w:r>
               <w:rPr>
@@ -22650,7 +22804,7 @@
                 <w:color w:val="2B2B36"/>
                 <w:sz w:val="20"/>
               </w:rPr>
-              <w:t>26 open: internal 9, kick-off meeting 15, content stage 3, PWD 2</w:t>
+              <w:t>26 open: internal 8, kick-off meeting 6, questionnaire Part A 6, questionnaire Part B 4, content stage 3, PWD 2</w:t>
             </w:r>
           </w:p>
         </w:tc>

</xml_diff>

<commit_message>
Willis Temby: About pages are funded by quote item 7
Co-Authored-By: Claude Opus 5.5 <noreply@anthropic.com>
Claude-Session: https://claude.ai/code/session_01MFMqg6zWXi6LFjkEQdnHcM
</commit_message>
<xml_diff>
--- a/Willis Temby - Master Doc Brief.docx
+++ b/Willis Temby - Master Doc Brief.docx
@@ -11740,7 +11740,7 @@
                 <w:color w:val="2B2B36"/>
                 <w:sz w:val="20"/>
               </w:rPr>
-              <w:t>5 internal templates named in the quote (Contact, industry landing, policy/product, Our People, blog/news), plus "internal page designs as required"</w:t>
+              <w:t>5 internal templates named in the quote (Contact, industry landing, policy/product, Our People, blog/news), plus "internal page designs as required", which covers About, Our Process, Community &amp; ESG and Careers</w:t>
             </w:r>
             <w:r>
               <w:rPr>
@@ -17279,7 +17279,7 @@
                 <w:color w:val="2B2B36"/>
                 <w:sz w:val="20"/>
               </w:rPr>
-              <w:t>TBC: no standard content template quoted</w:t>
+              <w:t>Internal page designs as required (quote item 7)</w:t>
             </w:r>
           </w:p>
         </w:tc>
@@ -17315,7 +17315,7 @@
                 <w:color w:val="2B2B36"/>
                 <w:sz w:val="20"/>
               </w:rPr>
-              <w:t>Decide at 27/10</w:t>
+              <w:t>Funded by the quote</w:t>
             </w:r>
             <w:r>
               <w:rPr>

</xml_diff>

<commit_message>
Willis Temby: Master Doc v0.9 and evidence log after the 29/10 kick-off
Transcript and questionnaire Part A and B answers filled in with source
tags; scope mismatches and actions logged in kickoff-evidence.md.

Co-Authored-By: Claude Opus 5.5 <noreply@anthropic.com>
Claude-Session: https://claude.ai/code/session_01MFMqg6zWXi6LFjkEQdnHcM
</commit_message>
<xml_diff>
--- a/Willis Temby - Master Doc Brief.docx
+++ b/Willis Temby - Master Doc Brief.docx
@@ -705,6 +705,160 @@
           </w:p>
         </w:tc>
       </w:tr>
+      <w:tr>
+        <w:trPr>
+          <w:cantSplit w:val="0"/>
+          <w:tblHeader w:val="0"/>
+        </w:trPr>
+        <w:tc>
+          <w:tcPr>
+            <w:tcBorders>
+              <w:top w:color="d5d8e2" w:space="0" w:sz="6" w:val="single"/>
+              <w:left w:color="d5d8e2" w:space="0" w:sz="6" w:val="single"/>
+              <w:bottom w:color="d5d8e2" w:space="0" w:sz="6" w:val="single"/>
+              <w:right w:color="d5d8e2" w:space="0" w:sz="6" w:val="single"/>
+            </w:tcBorders>
+            <w:shd w:fill="auto" w:val="clear"/>
+            <w:tcMar>
+              <w:top w:w="105.0" w:type="dxa"/>
+              <w:left w:w="150.0" w:type="dxa"/>
+              <w:bottom w:w="105.0" w:type="dxa"/>
+              <w:right w:w="150.0" w:type="dxa"/>
+            </w:tcMar>
+            <w:vAlign w:val="top"/>
+          </w:tcPr>
+          <w:p>
+            <w:pPr>
+              <w:widowControl w:val="0"/>
+              <w:spacing w:after="105" w:before="105" w:line="360" w:lineRule="auto"/>
+              <w:rPr>
+                <w:color w:val="2b2b36"/>
+                <w:sz w:val="20"/>
+                <w:szCs w:val="20"/>
+              </w:rPr>
+            </w:pPr>
+            <w:r>
+              <w:rPr>
+                <w:color w:val="2B2B36"/>
+                <w:sz w:val="20"/>
+              </w:rPr>
+              <w:t>v0.9</w:t>
+            </w:r>
+          </w:p>
+        </w:tc>
+        <w:tc>
+          <w:tcPr>
+            <w:tcBorders>
+              <w:top w:color="d5d8e2" w:space="0" w:sz="6" w:val="single"/>
+              <w:left w:color="d5d8e2" w:space="0" w:sz="6" w:val="single"/>
+              <w:bottom w:color="d5d8e2" w:space="0" w:sz="6" w:val="single"/>
+              <w:right w:color="d5d8e2" w:space="0" w:sz="6" w:val="single"/>
+            </w:tcBorders>
+            <w:shd w:fill="auto" w:val="clear"/>
+            <w:tcMar>
+              <w:top w:w="105.0" w:type="dxa"/>
+              <w:left w:w="150.0" w:type="dxa"/>
+              <w:bottom w:w="105.0" w:type="dxa"/>
+              <w:right w:w="150.0" w:type="dxa"/>
+            </w:tcMar>
+            <w:vAlign w:val="top"/>
+          </w:tcPr>
+          <w:p>
+            <w:pPr>
+              <w:widowControl w:val="0"/>
+              <w:spacing w:after="105" w:before="105" w:line="360" w:lineRule="auto"/>
+              <w:rPr>
+                <w:i w:val="1"/>
+                <w:iCs w:val="1"/>
+                <w:color w:val="8a8fa3"/>
+                <w:sz w:val="20"/>
+                <w:szCs w:val="20"/>
+              </w:rPr>
+            </w:pPr>
+            <w:r>
+              <w:rPr>
+                <w:color w:val="2B2B36"/>
+                <w:sz w:val="20"/>
+              </w:rPr>
+              <w:t>29/10/2026</w:t>
+            </w:r>
+          </w:p>
+        </w:tc>
+        <w:tc>
+          <w:tcPr>
+            <w:tcBorders>
+              <w:top w:color="d5d8e2" w:space="0" w:sz="6" w:val="single"/>
+              <w:left w:color="d5d8e2" w:space="0" w:sz="6" w:val="single"/>
+              <w:bottom w:color="d5d8e2" w:space="0" w:sz="6" w:val="single"/>
+              <w:right w:color="d5d8e2" w:space="0" w:sz="6" w:val="single"/>
+            </w:tcBorders>
+            <w:shd w:fill="auto" w:val="clear"/>
+            <w:tcMar>
+              <w:top w:w="105.0" w:type="dxa"/>
+              <w:left w:w="150.0" w:type="dxa"/>
+              <w:bottom w:w="105.0" w:type="dxa"/>
+              <w:right w:w="150.0" w:type="dxa"/>
+            </w:tcMar>
+            <w:vAlign w:val="top"/>
+          </w:tcPr>
+          <w:p>
+            <w:pPr>
+              <w:widowControl w:val="0"/>
+              <w:spacing w:after="105" w:before="105" w:line="360" w:lineRule="auto"/>
+              <w:rPr>
+                <w:i w:val="1"/>
+                <w:iCs w:val="1"/>
+                <w:color w:val="8a8fa3"/>
+                <w:sz w:val="20"/>
+                <w:szCs w:val="20"/>
+              </w:rPr>
+            </w:pPr>
+            <w:r>
+              <w:rPr>
+                <w:color w:val="2B2B36"/>
+                <w:sz w:val="20"/>
+              </w:rPr>
+              <w:t>Gabe Silva</w:t>
+            </w:r>
+          </w:p>
+        </w:tc>
+        <w:tc>
+          <w:tcPr>
+            <w:tcBorders>
+              <w:top w:color="d5d8e2" w:space="0" w:sz="6" w:val="single"/>
+              <w:left w:color="d5d8e2" w:space="0" w:sz="6" w:val="single"/>
+              <w:bottom w:color="d5d8e2" w:space="0" w:sz="6" w:val="single"/>
+              <w:right w:color="d5d8e2" w:space="0" w:sz="6" w:val="single"/>
+            </w:tcBorders>
+            <w:shd w:fill="auto" w:val="clear"/>
+            <w:tcMar>
+              <w:top w:w="105.0" w:type="dxa"/>
+              <w:left w:w="150.0" w:type="dxa"/>
+              <w:bottom w:w="105.0" w:type="dxa"/>
+              <w:right w:w="150.0" w:type="dxa"/>
+            </w:tcMar>
+            <w:vAlign w:val="top"/>
+          </w:tcPr>
+          <w:p>
+            <w:pPr>
+              <w:widowControl w:val="0"/>
+              <w:spacing w:after="105" w:before="105" w:line="360" w:lineRule="auto"/>
+              <w:rPr>
+                <w:color w:val="2b2b36"/>
+                <w:sz w:val="20"/>
+                <w:szCs w:val="20"/>
+              </w:rPr>
+            </w:pPr>
+            <w:r>
+              <w:rPr>
+                <w:color w:val="2B2B36"/>
+                <w:sz w:val="20"/>
+              </w:rPr>
+              <w:t>Kick-off 29/10 (transcript), questionnaire Part A and B answers. Not v1.0: sitemap changes from the client pending, scope checks open</w:t>
+            </w:r>
+          </w:p>
+        </w:tc>
+      </w:tr>
     </w:tbl>
     <w:p>
       <w:pPr>
@@ -2562,14 +2716,14 @@
                 <w:color w:val="C0392B"/>
                 <w:sz w:val="20"/>
               </w:rPr>
-              <w:t>TBC: internal</w:t>
+              <w:t>TBC: internal, Isabella, by email</w:t>
             </w:r>
             <w:r>
               <w:rPr>
                 <w:color w:val="8A8FA3"/>
                 <w:sz w:val="16"/>
               </w:rPr>
-              <w:t xml:space="preserve">  [M]</w:t>
+              <w:t xml:space="preserve">  [T 11:01]</w:t>
             </w:r>
           </w:p>
         </w:tc>
@@ -3542,14 +3696,14 @@
                 <w:color w:val="2B2B36"/>
                 <w:sz w:val="20"/>
               </w:rPr>
-              <w:t>Commercial insurance broking and risk advisory: tailored insurance programs, policy program review, claims advocacy, early injury intervention (Praventus)</w:t>
+              <w:t>Risk advisory and management, claims advocacy and tailored insurance for corporate and commercial clients. Also program review, early injury intervention through Praventus for workers' compensation clients, and premium funding.</w:t>
             </w:r>
             <w:r>
               <w:rPr>
                 <w:color w:val="8A8FA3"/>
                 <w:sz w:val="16"/>
               </w:rPr>
-              <w:t xml:space="preserve">  [H] [D]</w:t>
+              <w:t xml:space="preserve">  [Q2]</w:t>
             </w:r>
           </w:p>
         </w:tc>
@@ -3726,14 +3880,14 @@
                 <w:color w:val="2B2B36"/>
                 <w:sz w:val="20"/>
               </w:rPr>
-              <w:t>"Strategic insurance and risk advice designed for complex organisations, backed by deep technical expertise"; forward-thinking advice; proactive claims advocacy and early intervention; 40+ years</w:t>
+              <w:t>"Strategic insurance and risk advice that helps businesses grow with confidence." Client-focused, educates clients, a team that refines policies to get clients the best result. 40+ years.</w:t>
             </w:r>
             <w:r>
               <w:rPr>
                 <w:color w:val="8A8FA3"/>
                 <w:sz w:val="16"/>
               </w:rPr>
-              <w:t xml:space="preserve">  [D]</w:t>
+              <w:t xml:space="preserve">  [Q3] [T 35:15] [H]</w:t>
             </w:r>
           </w:p>
         </w:tc>
@@ -3819,22 +3973,14 @@
                 <w:color w:val="2B2B36"/>
                 <w:sz w:val="20"/>
               </w:rPr>
-              <w:t>Wants to read as credible and established to larger corporates, "corporate but still modern", not hectic like Knightcorp. Must sit clearly apart from Willis Towers Watson (WTW)</w:t>
-            </w:r>
-            <w:r>
-              <w:rPr>
-                <w:b/>
-                <w:color w:val="C0392B"/>
-                <w:sz w:val="20"/>
-              </w:rPr>
-              <w:t xml:space="preserve"> TBC: ask at kick-off</w:t>
+              <w:t>Repositioning from a WA broker to an Australian one: "we don't really want to be saying that we are from WA". One director sits on the National Insurance Brokers Association board. Wants visitors to see "professional, smart, and we can get the job done", with an easy process that still looks intelligent, "without making it look stupid". Must sit clearly apart from Willis Towers Watson.</w:t>
             </w:r>
             <w:r>
               <w:rPr>
                 <w:color w:val="8A8FA3"/>
                 <w:sz w:val="16"/>
               </w:rPr>
-              <w:t xml:space="preserve">  [T 11:16] [T 10:23] [H] [M]</w:t>
+              <w:t xml:space="preserve">  [T 05:51] [T 34:14] [T 35:15] [Q6] [H]</w:t>
             </w:r>
           </w:p>
         </w:tc>
@@ -3920,22 +4066,14 @@
                 <w:color w:val="2B2B36"/>
                 <w:sz w:val="20"/>
               </w:rPr>
-              <w:t>Isabella Breheny (Head of Marketing and Communications, signed as Isabella Popov) runs it day to day. Executive Directors Alex Rowland and Brett Piggott approve at milestones. Cameron (camerong@) sat in the kick-off, role unconfirmed</w:t>
-            </w:r>
-            <w:r>
-              <w:rPr>
-                <w:b/>
-                <w:color w:val="C0392B"/>
-                <w:sz w:val="20"/>
-              </w:rPr>
-              <w:t xml:space="preserve"> TBC: questionnaire Part A Q7, Q8</w:t>
+              <w:t>Isabella Breheny (Head of Marketing and Communications, the only marketing person) runs it day to day. Sign-off is "all of us, together": Isabella, Alex Rowland and Brett Piggott. Formal approvals go to the weekly team meeting, so allow about a week per round; small questions about 2 days. Only Isabella has attended a kick-off; the directors have not been on a call.</w:t>
             </w:r>
             <w:r>
               <w:rPr>
                 <w:color w:val="8A8FA3"/>
                 <w:sz w:val="16"/>
               </w:rPr>
-              <w:t xml:space="preserve">  [H] [G 19/10] [T 02:46]</w:t>
+              <w:t xml:space="preserve">  [Q13] [T 28:12] [T 04:41]</w:t>
             </w:r>
           </w:p>
         </w:tc>
@@ -4268,14 +4406,14 @@
                 <w:color w:val="2B2B36"/>
                 <w:sz w:val="20"/>
               </w:rPr>
-              <w:t>Convert the inbound demand they already get into enquiries from larger corporates. Lead generation and organic search over awareness</w:t>
+              <w:t>Be found online and convert more form submissions, so new business does not rely only on referrals and the directors being out and about. Reposition as a trusted Australian brokerage nationwide. Australia only for the next 2 to 3 years.</w:t>
             </w:r>
             <w:r>
               <w:rPr>
                 <w:color w:val="8A8FA3"/>
                 <w:sz w:val="16"/>
               </w:rPr>
-              <w:t xml:space="preserve">  [H] [T 11:16] [T 15:57]</w:t>
+              <w:t xml:space="preserve">  [Q6] [T 04:41] [T 05:51] [T 34:14]</w:t>
             </w:r>
           </w:p>
         </w:tc>
@@ -4366,14 +4504,14 @@
                 <w:color w:val="2B2B36"/>
                 <w:sz w:val="20"/>
               </w:rPr>
-              <w:t>Contact us (enquiry form, then call). Pay an Invoice is off the homepage</w:t>
+              <w:t>Contact us, as the highlighted menu button.</w:t>
             </w:r>
             <w:r>
               <w:rPr>
                 <w:color w:val="8A8FA3"/>
                 <w:sz w:val="16"/>
               </w:rPr>
-              <w:t xml:space="preserve">  [D] [T 14:48] [T 15:57]</w:t>
+              <w:t xml:space="preserve">  [T 24:51] [Q9]</w:t>
             </w:r>
           </w:p>
         </w:tc>
@@ -4459,22 +4597,14 @@
                 <w:color w:val="2B2B36"/>
                 <w:sz w:val="20"/>
               </w:rPr>
-              <w:t>Draft from the menu utilities: Request a quote, Lodge a claim, Lodge workplace injury. Three, so one must drop to a menu link</w:t>
-            </w:r>
-            <w:r>
-              <w:rPr>
-                <w:b/>
-                <w:color w:val="C0392B"/>
-                <w:sz w:val="20"/>
-              </w:rPr>
-              <w:t xml:space="preserve"> TBC: ask at kick-off</w:t>
+              <w:t>Lodge a Claim and Pay an Invoice, both under Contact in the menu. Request a Quote and Workplace Injury are menu links.</w:t>
             </w:r>
             <w:r>
               <w:rPr>
                 <w:color w:val="8A8FA3"/>
                 <w:sz w:val="16"/>
               </w:rPr>
-              <w:t xml:space="preserve">  [D]</w:t>
+              <w:t xml:space="preserve">  [T 24:51]</w:t>
             </w:r>
           </w:p>
         </w:tc>
@@ -5077,14 +5207,14 @@
                 <w:color w:val="2B2B36"/>
                 <w:sz w:val="20"/>
               </w:rPr>
-              <w:t>Operations directors, CFOs, owners and risk managers in marine, mining and resources, construction, energy, commercial property</w:t>
+              <w:t>Owners, CEOs, CFOs, managing directors, operations directors and risk managers of mid to large commercial businesses in high-risk and specialised sectors: marine, mining and resources, construction, energy, medical and property.</w:t>
             </w:r>
             <w:r>
               <w:rPr>
                 <w:color w:val="8A8FA3"/>
                 <w:sz w:val="16"/>
               </w:rPr>
-              <w:t xml:space="preserve">  [H] [D]</w:t>
+              <w:t xml:space="preserve">  [Q5]</w:t>
             </w:r>
           </w:p>
         </w:tc>
@@ -5458,14 +5588,14 @@
                 <w:color w:val="2B2B36"/>
                 <w:sz w:val="20"/>
               </w:rPr>
-              <w:t>Centrewest and Knightcorp (named by client), Phoenix Insurance, Bellrock (benchmark). Bellrock Advisory is a liked site, not a competitor</w:t>
+              <w:t>Centrewest, Knightcorp, Lockton, Howden, EBM (client's list). Bellrock Advisory is a liked site, not a competitor.</w:t>
             </w:r>
             <w:r>
               <w:rPr>
                 <w:color w:val="8A8FA3"/>
                 <w:sz w:val="16"/>
               </w:rPr>
-              <w:t xml:space="preserve">  [H] [T 10:23]</w:t>
+              <w:t xml:space="preserve">  [Q4] [H]</w:t>
             </w:r>
           </w:p>
         </w:tc>
@@ -7058,7 +7188,7 @@
                 <w:color w:val="2B2B36"/>
                 <w:sz w:val="20"/>
               </w:rPr>
-              <w:t>Bold, assured, modern, clean, credible. Simple but with some interest (light animation, layered horizontal segments)</w:t>
+              <w:t>Modern and bold, professional, eye-catching, simple yet reflecting intelligence, expert but relatable, minimal and not too busy; colour tones like atmosgroup.com.au</w:t>
             </w:r>
           </w:p>
         </w:tc>
@@ -7096,14 +7226,14 @@
                 <w:color w:val="2B2B36"/>
                 <w:sz w:val="20"/>
               </w:rPr>
-              <w:t>Generic broker, hectic or graphic-heavy (Knightcorp), childlike colour, cold sterile corporate, thin type with no presence</w:t>
+              <w:t>Busy, text-heavy homepage, anything that makes the process "look stupid", hectic or graphic-heavy (Knightcorp), generic broker</w:t>
             </w:r>
             <w:r>
               <w:rPr>
                 <w:color w:val="8A8FA3"/>
                 <w:sz w:val="16"/>
               </w:rPr>
-              <w:t xml:space="preserve">  [D] [T 13:35] [T 10:23]</w:t>
+              <w:t xml:space="preserve">  [Q7] [T 21:11] [T 23:48] [T 35:15] [Q8]</w:t>
             </w:r>
           </w:p>
         </w:tc>
@@ -7447,7 +7577,7 @@
                 <w:color w:val="2B2B36"/>
                 <w:sz w:val="20"/>
               </w:rPr>
-              <w:t>Simple but aesthetic balance, horizontal bars, light animation, gradient within one hue</w:t>
+              <w:t>Opening visual; hover section with different headings that lead to the same pages; mix of graphics and photos; clean, "not too busy"</w:t>
             </w:r>
           </w:p>
         </w:tc>
@@ -7492,7 +7622,7 @@
                 <w:color w:val="8A8FA3"/>
                 <w:sz w:val="16"/>
               </w:rPr>
-              <w:t xml:space="preserve">  [T 13:35] [D]</w:t>
+              <w:t xml:space="preserve">  [T 21:11] [Q8]</w:t>
             </w:r>
           </w:p>
         </w:tc>
@@ -7610,7 +7740,7 @@
                 <w:color w:val="2B2B36"/>
                 <w:sz w:val="20"/>
               </w:rPr>
-              <w:t>Boat to road (to mine site) transition, segments</w:t>
+              <w:t>Opening video banner, the boat into the road shot, with text over it</w:t>
             </w:r>
           </w:p>
         </w:tc>
@@ -7648,14 +7778,14 @@
                 <w:color w:val="2B2B36"/>
                 <w:sz w:val="20"/>
               </w:rPr>
-              <w:t>Heavy media if it slows load</w:t>
+              <w:t>Their hover block for main nav (fine for Insights only)</w:t>
             </w:r>
             <w:r>
               <w:rPr>
                 <w:color w:val="8A8FA3"/>
                 <w:sz w:val="16"/>
               </w:rPr>
-              <w:t xml:space="preserve">  [D]</w:t>
+              <w:t xml:space="preserve">  [T 22:33] [Q8]</w:t>
             </w:r>
           </w:p>
         </w:tc>
@@ -7697,7 +7827,7 @@
                 <w:color w:val="2B2B36"/>
                 <w:sz w:val="20"/>
               </w:rPr>
-              <w:t>centrewest.com.au</w:t>
+              <w:t>miramargroup.com.au</w:t>
             </w:r>
           </w:p>
         </w:tc>
@@ -7735,7 +7865,7 @@
                 <w:color w:val="2B2B36"/>
                 <w:sz w:val="20"/>
               </w:rPr>
-              <w:t>Client and competitor</w:t>
+              <w:t>Client</w:t>
             </w:r>
           </w:p>
         </w:tc>
@@ -7773,7 +7903,7 @@
                 <w:color w:val="2B2B36"/>
                 <w:sz w:val="20"/>
               </w:rPr>
-              <w:t>A letter or mark pulled from the logo into page design</w:t>
+              <w:t>Logo icon used through the design, text carousel in coloured rectangles</w:t>
             </w:r>
           </w:p>
         </w:tc>
@@ -7811,14 +7941,14 @@
                 <w:color w:val="2B2B36"/>
                 <w:sz w:val="20"/>
               </w:rPr>
-              <w:t>Anything that makes WT look like a competitor</w:t>
+              <w:t>Not discussed; take only the point named</w:t>
             </w:r>
             <w:r>
               <w:rPr>
                 <w:color w:val="8A8FA3"/>
                 <w:sz w:val="16"/>
               </w:rPr>
-              <w:t xml:space="preserve">  [M] [T 10:23]</w:t>
+              <w:t xml:space="preserve">  [Q8]</w:t>
             </w:r>
           </w:p>
         </w:tc>
@@ -7860,7 +7990,7 @@
                 <w:color w:val="2B2B36"/>
                 <w:sz w:val="20"/>
               </w:rPr>
-              <w:t>cloudpg.com.au</w:t>
+              <w:t>arrivalhall.com.au</w:t>
             </w:r>
           </w:p>
         </w:tc>
@@ -7936,7 +8066,7 @@
                 <w:color w:val="2B2B36"/>
                 <w:sz w:val="20"/>
               </w:rPr>
-              <w:t>Layered segments on desktop</w:t>
+              <w:t>Stacked sections, vibrance</w:t>
             </w:r>
           </w:p>
         </w:tc>
@@ -7974,14 +8104,14 @@
                 <w:color w:val="2B2B36"/>
                 <w:sz w:val="20"/>
               </w:rPr>
-              <w:t>Their mobile conversion</w:t>
+              <w:t>Not discussed; take only the point named</w:t>
             </w:r>
             <w:r>
               <w:rPr>
                 <w:color w:val="8A8FA3"/>
                 <w:sz w:val="16"/>
               </w:rPr>
-              <w:t xml:space="preserve">  [D]</w:t>
+              <w:t xml:space="preserve">  [Q8]</w:t>
             </w:r>
           </w:p>
         </w:tc>
@@ -8023,7 +8153,7 @@
                 <w:color w:val="2B2B36"/>
                 <w:sz w:val="20"/>
               </w:rPr>
-              <w:t>knightcorp.insure</w:t>
+              <w:t>insightmercantile.com</w:t>
             </w:r>
           </w:p>
         </w:tc>
@@ -8061,7 +8191,7 @@
                 <w:color w:val="2B2B36"/>
                 <w:sz w:val="20"/>
               </w:rPr>
-              <w:t>Client competitor</w:t>
+              <w:t>Client</w:t>
             </w:r>
           </w:p>
         </w:tc>
@@ -8099,7 +8229,7 @@
                 <w:color w:val="2B2B36"/>
                 <w:sz w:val="20"/>
               </w:rPr>
-              <w:t>Modern custom feel</w:t>
+              <w:t>Segmented visual blocks further down the page</w:t>
             </w:r>
           </w:p>
         </w:tc>
@@ -8137,14 +8267,14 @@
                 <w:color w:val="2B2B36"/>
                 <w:sz w:val="20"/>
               </w:rPr>
-              <w:t>Hectic, graphic-heavy, weak SEO</w:t>
+              <w:t>Busier opening with nothing to draw attention</w:t>
             </w:r>
             <w:r>
               <w:rPr>
                 <w:color w:val="8A8FA3"/>
                 <w:sz w:val="16"/>
               </w:rPr>
-              <w:t xml:space="preserve">  [H] [T 10:23]</w:t>
+              <w:t xml:space="preserve">  [T 23:48] [Q8]</w:t>
             </w:r>
           </w:p>
         </w:tc>
@@ -8559,22 +8689,14 @@
                 <w:color w:val="2B2B36"/>
                 <w:sz w:val="20"/>
               </w:rPr>
-              <w:t>Very few own images: a couple of older team photos. Wants real operating environments (boats, trucks, mine sites), not stock office shots</w:t>
-            </w:r>
-            <w:r>
-              <w:rPr>
-                <w:b/>
-                <w:color w:val="C0392B"/>
-                <w:sz w:val="20"/>
-              </w:rPr>
-              <w:t xml:space="preserve"> TBC: questionnaire Part A Q5</w:t>
+              <w:t>Very few own images. Client asks PWD to quote or recommend external providers for team headshots and video of the industries they work in. Not in the current quote.</w:t>
             </w:r>
             <w:r>
               <w:rPr>
                 <w:color w:val="8A8FA3"/>
                 <w:sz w:val="16"/>
               </w:rPr>
-              <w:t xml:space="preserve">  [T 19:25] [M]</w:t>
+              <w:t xml:space="preserve">  [Q10] [T 19:25] [E]</w:t>
             </w:r>
           </w:p>
         </w:tc>
@@ -8751,22 +8873,14 @@
                 <w:color w:val="2B2B36"/>
                 <w:sz w:val="20"/>
               </w:rPr>
-              <w:t>Hero video preferred (stock, showing the range of operating environments); auto image slider is the fallback. Boat to road to mine site transition idea</w:t>
-            </w:r>
-            <w:r>
-              <w:rPr>
-                <w:b/>
-                <w:color w:val="C0392B"/>
-                <w:sz w:val="20"/>
-              </w:rPr>
-              <w:t xml:space="preserve"> TBC: questionnaire Part A Q6</w:t>
+              <w:t>Opening video banner wanted, like tattarang.com's boat to road shot, with text over it. Footage not sourced; client asked for a quote or provider recommendation.</w:t>
             </w:r>
             <w:r>
               <w:rPr>
                 <w:color w:val="8A8FA3"/>
                 <w:sz w:val="16"/>
               </w:rPr>
-              <w:t xml:space="preserve">  [D]</w:t>
+              <w:t xml:space="preserve">  [T 22:33] [Q10]</w:t>
             </w:r>
           </w:p>
         </w:tc>
@@ -9082,7 +9196,7 @@
                 <w:color w:val="2B2B36"/>
                 <w:sz w:val="20"/>
               </w:rPr>
-              <w:t>DRAFT. Mia committed to send it for approval after 21/07; no approval date recorded</w:t>
+              <w:t>DRAFT. Sitemap V1 (PWD) shown at kick-off. Client has its own copy of an earlier PWD sitemap with comments and further changes discussed with Eleanor, and will email it. Not approved.</w:t>
             </w:r>
             <w:r>
               <w:rPr>
@@ -9090,14 +9204,14 @@
                 <w:color w:val="C0392B"/>
                 <w:sz w:val="20"/>
               </w:rPr>
-              <w:t xml:space="preserve"> TBC: internal</w:t>
+              <w:t xml:space="preserve"> TBC: internal, Isabella to send changes, then V2 for approval</w:t>
             </w:r>
             <w:r>
               <w:rPr>
                 <w:color w:val="8A8FA3"/>
                 <w:sz w:val="16"/>
               </w:rPr>
-              <w:t xml:space="preserve">  [T 29:14]</w:t>
+              <w:t xml:space="preserve">  [T 13:09] [PC 29/10]</w:t>
             </w:r>
           </w:p>
         </w:tc>
@@ -9942,7 +10056,7 @@
                 <w:color w:val="2B2B36"/>
                 <w:sz w:val="20"/>
               </w:rPr>
-              <w:t>Hero</w:t>
+              <w:t>Header and mega menu</w:t>
             </w:r>
           </w:p>
         </w:tc>
@@ -9978,7 +10092,7 @@
                 <w:color w:val="2B2B36"/>
                 <w:sz w:val="20"/>
               </w:rPr>
-              <w:t>Say who it is for and drive Contact us</w:t>
+              <w:t>Sector and Risk menus, Contact as the highlighted button with Pay an Invoice and Lodge a Claim beneath it</w:t>
             </w:r>
           </w:p>
         </w:tc>
@@ -10016,14 +10130,13 @@
                 <w:color w:val="2B2B36"/>
                 <w:sz w:val="20"/>
               </w:rPr>
-              <w:t>H1 Protecting today. Powering tomorrow. Video preferred, slider fallback</w:t>
             </w:r>
             <w:r>
               <w:rPr>
                 <w:color w:val="8A8FA3"/>
                 <w:sz w:val="16"/>
               </w:rPr>
-              <w:t xml:space="preserve">  [D]</w:t>
+              <w:t xml:space="preserve">  [T 24:51]</w:t>
             </w:r>
           </w:p>
         </w:tc>
@@ -10059,7 +10172,7 @@
                 <w:color w:val="2B2B36"/>
                 <w:sz w:val="20"/>
               </w:rPr>
-              <w:t>Copy ready, video not sourced</w:t>
+              <w:t>Structure agreed</w:t>
             </w:r>
           </w:p>
         </w:tc>
@@ -10140,7 +10253,7 @@
                 <w:color w:val="2B2B36"/>
                 <w:sz w:val="20"/>
               </w:rPr>
-              <w:t>About us</w:t>
+              <w:t>Video banner</w:t>
             </w:r>
           </w:p>
         </w:tc>
@@ -10176,7 +10289,7 @@
                 <w:color w:val="2B2B36"/>
                 <w:sz w:val="20"/>
               </w:rPr>
-              <w:t>Credibility: 40 years, locally owned, nationally connected</w:t>
+              <w:t>Show the range of operating environments and drive Contact us</w:t>
             </w:r>
           </w:p>
         </w:tc>
@@ -10214,14 +10327,14 @@
                 <w:color w:val="2B2B36"/>
                 <w:sz w:val="20"/>
               </w:rPr>
-              <w:t>Team photos suggested to humanise</w:t>
+              <w:t>Like tattarang.com's boat to road shot, text over the top</w:t>
             </w:r>
             <w:r>
               <w:rPr>
                 <w:color w:val="8A8FA3"/>
                 <w:sz w:val="16"/>
               </w:rPr>
-              <w:t xml:space="preserve">  [D] [T 19:25]</w:t>
+              <w:t xml:space="preserve">  [T 22:33]</w:t>
             </w:r>
           </w:p>
         </w:tc>
@@ -10257,7 +10370,7 @@
                 <w:color w:val="2B2B36"/>
                 <w:sz w:val="20"/>
               </w:rPr>
-              <w:t>Copy ready</w:t>
+              <w:t>Footage not sourced</w:t>
             </w:r>
           </w:p>
         </w:tc>
@@ -10338,7 +10451,7 @@
                 <w:color w:val="2B2B36"/>
                 <w:sz w:val="20"/>
               </w:rPr>
-              <w:t>Industries we support</w:t>
+              <w:t>About us</w:t>
             </w:r>
           </w:p>
         </w:tc>
@@ -10374,7 +10487,7 @@
                 <w:color w:val="2B2B36"/>
                 <w:sz w:val="20"/>
               </w:rPr>
-              <w:t>Let visitors self-identify by sector</w:t>
+              <w:t>A short "little about us" for credibility</w:t>
             </w:r>
           </w:p>
         </w:tc>
@@ -10412,14 +10525,14 @@
                 <w:color w:val="2B2B36"/>
                 <w:sz w:val="20"/>
               </w:rPr>
-              <w:t>Design to solve surfacing sectors without a page per middle tier</w:t>
+              <w:t>Australian, not WA, positioning</w:t>
             </w:r>
             <w:r>
               <w:rPr>
                 <w:color w:val="8A8FA3"/>
                 <w:sz w:val="16"/>
               </w:rPr>
-              <w:t xml:space="preserve">  [D]</w:t>
+              <w:t xml:space="preserve">  [T 23:48] [T 05:51]</w:t>
             </w:r>
           </w:p>
         </w:tc>
@@ -10455,7 +10568,7 @@
                 <w:color w:val="2B2B36"/>
                 <w:sz w:val="20"/>
               </w:rPr>
-              <w:t>Labels ready, layout open</w:t>
+              <w:t>Draft copy</w:t>
             </w:r>
           </w:p>
         </w:tc>
@@ -10536,7 +10649,7 @@
                 <w:color w:val="2B2B36"/>
                 <w:sz w:val="20"/>
               </w:rPr>
-              <w:t>Product highlight</w:t>
+              <w:t>How we operate</w:t>
             </w:r>
           </w:p>
         </w:tc>
@@ -10572,7 +10685,7 @@
                 <w:color w:val="2B2B36"/>
                 <w:sz w:val="20"/>
               </w:rPr>
-              <w:t>Route to risk solutions, employee risk and claims</w:t>
+              <w:t>How the team works for clients</w:t>
             </w:r>
           </w:p>
         </w:tc>
@@ -10610,14 +10723,13 @@
                 <w:color w:val="2B2B36"/>
                 <w:sz w:val="20"/>
               </w:rPr>
-              <w:t>Three columns or bands</w:t>
             </w:r>
             <w:r>
               <w:rPr>
                 <w:color w:val="8A8FA3"/>
                 <w:sz w:val="16"/>
               </w:rPr>
-              <w:t xml:space="preserve">  [D]</w:t>
+              <w:t xml:space="preserve">  [T 23:48]</w:t>
             </w:r>
           </w:p>
         </w:tc>
@@ -10653,7 +10765,7 @@
                 <w:color w:val="2B2B36"/>
                 <w:sz w:val="20"/>
               </w:rPr>
-              <w:t>Copy ready</w:t>
+              <w:t>Draft copy</w:t>
             </w:r>
           </w:p>
         </w:tc>
@@ -10734,7 +10846,7 @@
                 <w:color w:val="2B2B36"/>
                 <w:sz w:val="20"/>
               </w:rPr>
-              <w:t>Expertise</w:t>
+              <w:t>Our process</w:t>
             </w:r>
           </w:p>
         </w:tc>
@@ -10770,7 +10882,7 @@
                 <w:color w:val="2B2B36"/>
                 <w:sz w:val="20"/>
               </w:rPr>
-              <w:t>Prove sector depth</w:t>
+              <w:t>Show the steps so it feels easy</w:t>
             </w:r>
           </w:p>
         </w:tc>
@@ -10808,14 +10920,13 @@
                 <w:color w:val="2B2B36"/>
                 <w:sz w:val="20"/>
               </w:rPr>
-              <w:t>Deep sector knowledge. Smarter risk outcomes.</w:t>
             </w:r>
             <w:r>
               <w:rPr>
                 <w:color w:val="8A8FA3"/>
                 <w:sz w:val="16"/>
               </w:rPr>
-              <w:t xml:space="preserve">  [D]</w:t>
+              <w:t xml:space="preserve">  [T 23:48]</w:t>
             </w:r>
           </w:p>
         </w:tc>
@@ -10851,7 +10962,7 @@
                 <w:color w:val="2B2B36"/>
                 <w:sz w:val="20"/>
               </w:rPr>
-              <w:t>Copy ready</w:t>
+              <w:t>Draft copy</w:t>
             </w:r>
           </w:p>
         </w:tc>
@@ -10932,7 +11043,7 @@
                 <w:color w:val="2B2B36"/>
                 <w:sz w:val="20"/>
               </w:rPr>
-              <w:t>Process</w:t>
+              <w:t>Service blocks</w:t>
             </w:r>
           </w:p>
         </w:tc>
@@ -10968,7 +11079,7 @@
                 <w:color w:val="2B2B36"/>
                 <w:sz w:val="20"/>
               </w:rPr>
-              <w:t>Lower the barrier to a first conversation</w:t>
+              <w:t>Route visitors to services, sectors and risks</w:t>
             </w:r>
           </w:p>
         </w:tc>
@@ -11006,14 +11117,14 @@
                 <w:color w:val="2B2B36"/>
                 <w:sz w:val="20"/>
               </w:rPr>
-              <w:t>Six steps, horizontal track</w:t>
+              <w:t>Bellrock-style hover links with different headings to the same pages</w:t>
             </w:r>
             <w:r>
               <w:rPr>
                 <w:color w:val="8A8FA3"/>
                 <w:sz w:val="16"/>
               </w:rPr>
-              <w:t xml:space="preserve">  [D]</w:t>
+              <w:t xml:space="preserve">  [T 23:48] [T 21:11]</w:t>
             </w:r>
           </w:p>
         </w:tc>
@@ -11049,7 +11160,7 @@
                 <w:color w:val="2B2B36"/>
                 <w:sz w:val="20"/>
               </w:rPr>
-              <w:t>Copy ready</w:t>
+              <w:t>Draft copy</w:t>
             </w:r>
           </w:p>
         </w:tc>
@@ -11130,7 +11241,7 @@
                 <w:color w:val="2B2B36"/>
                 <w:sz w:val="20"/>
               </w:rPr>
-              <w:t>Testimonials</w:t>
+              <w:t>Footer</w:t>
             </w:r>
           </w:p>
         </w:tc>
@@ -11166,7 +11277,7 @@
                 <w:color w:val="2B2B36"/>
                 <w:sz w:val="20"/>
               </w:rPr>
-              <w:t>Humanise, first name and industry only</w:t>
+              <w:t>AFSL details, compliance documents, LinkedIn only</w:t>
             </w:r>
           </w:p>
         </w:tc>
@@ -11204,14 +11315,13 @@
                 <w:color w:val="2B2B36"/>
                 <w:sz w:val="20"/>
               </w:rPr>
-              <w:t>No company names or logos</w:t>
             </w:r>
             <w:r>
               <w:rPr>
                 <w:color w:val="8A8FA3"/>
                 <w:sz w:val="16"/>
               </w:rPr>
-              <w:t xml:space="preserve">  [T 18:05] [M]</w:t>
+              <w:t xml:space="preserve">  [Q9] [T 19:59]</w:t>
             </w:r>
           </w:p>
         </w:tc>
@@ -11247,205 +11357,7 @@
                 <w:color w:val="2B2B36"/>
                 <w:sz w:val="20"/>
               </w:rPr>
-              <w:t>Not supplied</w:t>
-            </w:r>
-          </w:p>
-        </w:tc>
-      </w:tr>
-      <w:tr>
-        <w:trPr>
-          <w:cantSplit w:val="0"/>
-          <w:tblHeader w:val="0"/>
-        </w:trPr>
-        <w:tc>
-          <w:tcPr>
-            <w:tcBorders>
-              <w:top w:color="d5d8e2" w:space="0" w:sz="6" w:val="single"/>
-              <w:left w:color="d5d8e2" w:space="0" w:sz="6" w:val="single"/>
-              <w:bottom w:color="d5d8e2" w:space="0" w:sz="6" w:val="single"/>
-              <w:right w:color="d5d8e2" w:space="0" w:sz="6" w:val="single"/>
-            </w:tcBorders>
-            <w:shd w:fill="auto" w:val="clear"/>
-            <w:tcMar>
-              <w:top w:w="105.0" w:type="dxa"/>
-              <w:left w:w="120.0" w:type="dxa"/>
-              <w:bottom w:w="105.0" w:type="dxa"/>
-              <w:right w:w="120.0" w:type="dxa"/>
-            </w:tcMar>
-            <w:vAlign w:val="top"/>
-          </w:tcPr>
-          <w:p>
-            <w:pPr>
-              <w:widowControl w:val="0"/>
-              <w:spacing w:after="105" w:before="105" w:line="360" w:lineRule="auto"/>
-              <w:rPr>
-                <w:color w:val="2b2b36"/>
-                <w:sz w:val="18"/>
-                <w:szCs w:val="18"/>
-              </w:rPr>
-            </w:pPr>
-            <w:r>
-              <w:rPr>
-                <w:color w:val="2B2B36"/>
-                <w:sz w:val="20"/>
-              </w:rPr>
-              <w:t>8</w:t>
-            </w:r>
-          </w:p>
-        </w:tc>
-        <w:tc>
-          <w:tcPr>
-            <w:tcBorders>
-              <w:top w:color="d5d8e2" w:space="0" w:sz="6" w:val="single"/>
-              <w:left w:color="d5d8e2" w:space="0" w:sz="6" w:val="single"/>
-              <w:bottom w:color="d5d8e2" w:space="0" w:sz="6" w:val="single"/>
-              <w:right w:color="d5d8e2" w:space="0" w:sz="6" w:val="single"/>
-            </w:tcBorders>
-            <w:shd w:fill="auto" w:val="clear"/>
-            <w:tcMar>
-              <w:top w:w="105.0" w:type="dxa"/>
-              <w:left w:w="120.0" w:type="dxa"/>
-              <w:bottom w:w="105.0" w:type="dxa"/>
-              <w:right w:w="120.0" w:type="dxa"/>
-            </w:tcMar>
-            <w:vAlign w:val="top"/>
-          </w:tcPr>
-          <w:p>
-            <w:pPr>
-              <w:widowControl w:val="0"/>
-              <w:spacing w:after="105" w:before="105" w:line="360" w:lineRule="auto"/>
-              <w:rPr>
-                <w:b w:val="1"/>
-                <w:bCs w:val="1"/>
-                <w:color w:val="2b2b36"/>
-                <w:sz w:val="18"/>
-                <w:szCs w:val="18"/>
-              </w:rPr>
-            </w:pPr>
-            <w:r>
-              <w:rPr>
-                <w:b/>
-                <w:color w:val="2B2B36"/>
-                <w:sz w:val="20"/>
-              </w:rPr>
-              <w:t>Insights and contact</w:t>
-            </w:r>
-          </w:p>
-        </w:tc>
-        <w:tc>
-          <w:tcPr>
-            <w:tcBorders>
-              <w:top w:color="d5d8e2" w:space="0" w:sz="6" w:val="single"/>
-              <w:left w:color="d5d8e2" w:space="0" w:sz="6" w:val="single"/>
-              <w:bottom w:color="d5d8e2" w:space="0" w:sz="6" w:val="single"/>
-              <w:right w:color="d5d8e2" w:space="0" w:sz="6" w:val="single"/>
-            </w:tcBorders>
-            <w:shd w:fill="auto" w:val="clear"/>
-            <w:tcMar>
-              <w:top w:w="105.0" w:type="dxa"/>
-              <w:left w:w="120.0" w:type="dxa"/>
-              <w:bottom w:w="105.0" w:type="dxa"/>
-              <w:right w:w="120.0" w:type="dxa"/>
-            </w:tcMar>
-            <w:vAlign w:val="top"/>
-          </w:tcPr>
-          <w:p>
-            <w:pPr>
-              <w:widowControl w:val="0"/>
-              <w:spacing w:after="105" w:before="105" w:line="360" w:lineRule="auto"/>
-              <w:rPr>
-                <w:color w:val="2b2b36"/>
-                <w:sz w:val="18"/>
-                <w:szCs w:val="18"/>
-              </w:rPr>
-            </w:pPr>
-            <w:r>
-              <w:rPr>
-                <w:color w:val="2B2B36"/>
-                <w:sz w:val="20"/>
-              </w:rPr>
-              <w:t>Show currency, close with the enquiry form</w:t>
-            </w:r>
-          </w:p>
-        </w:tc>
-        <w:tc>
-          <w:tcPr>
-            <w:tcBorders>
-              <w:top w:color="d5d8e2" w:space="0" w:sz="6" w:val="single"/>
-              <w:left w:color="d5d8e2" w:space="0" w:sz="6" w:val="single"/>
-              <w:bottom w:color="d5d8e2" w:space="0" w:sz="6" w:val="single"/>
-              <w:right w:color="d5d8e2" w:space="0" w:sz="6" w:val="single"/>
-            </w:tcBorders>
-            <w:shd w:fill="auto" w:val="clear"/>
-            <w:tcMar>
-              <w:top w:w="105.0" w:type="dxa"/>
-              <w:left w:w="120.0" w:type="dxa"/>
-              <w:bottom w:w="105.0" w:type="dxa"/>
-              <w:right w:w="120.0" w:type="dxa"/>
-            </w:tcMar>
-            <w:vAlign w:val="top"/>
-          </w:tcPr>
-          <w:p>
-            <w:pPr>
-              <w:widowControl w:val="0"/>
-              <w:spacing w:after="105" w:before="105" w:line="360" w:lineRule="auto"/>
-              <w:rPr>
-                <w:i w:val="1"/>
-                <w:iCs w:val="1"/>
-                <w:color w:val="8a8fa3"/>
-                <w:sz w:val="18"/>
-                <w:szCs w:val="18"/>
-              </w:rPr>
-            </w:pPr>
-            <w:r>
-              <w:rPr>
-                <w:color w:val="2B2B36"/>
-                <w:sz w:val="20"/>
-              </w:rPr>
-              <w:t>Insights must blend with the site</w:t>
-            </w:r>
-            <w:r>
-              <w:rPr>
-                <w:color w:val="8A8FA3"/>
-                <w:sz w:val="16"/>
-              </w:rPr>
-              <w:t xml:space="preserve">  [M]</w:t>
-            </w:r>
-          </w:p>
-        </w:tc>
-        <w:tc>
-          <w:tcPr>
-            <w:tcBorders>
-              <w:top w:color="d5d8e2" w:space="0" w:sz="6" w:val="single"/>
-              <w:left w:color="d5d8e2" w:space="0" w:sz="6" w:val="single"/>
-              <w:bottom w:color="d5d8e2" w:space="0" w:sz="6" w:val="single"/>
-              <w:right w:color="d5d8e2" w:space="0" w:sz="6" w:val="single"/>
-            </w:tcBorders>
-            <w:shd w:fill="auto" w:val="clear"/>
-            <w:tcMar>
-              <w:top w:w="105.0" w:type="dxa"/>
-              <w:left w:w="120.0" w:type="dxa"/>
-              <w:bottom w:w="105.0" w:type="dxa"/>
-              <w:right w:w="120.0" w:type="dxa"/>
-            </w:tcMar>
-            <w:vAlign w:val="top"/>
-          </w:tcPr>
-          <w:p>
-            <w:pPr>
-              <w:widowControl w:val="0"/>
-              <w:spacing w:after="105" w:before="105" w:line="360" w:lineRule="auto"/>
-              <w:rPr>
-                <w:color w:val="2b2b36"/>
-                <w:sz w:val="18"/>
-                <w:szCs w:val="18"/>
-              </w:rPr>
-            </w:pPr>
-            <w:r>
-              <w:rPr>
-                <w:color w:val="2B2B36"/>
-                <w:sz w:val="20"/>
-              </w:rPr>
-              <w:t>Not supplied</w:t>
+              <w:t>Later</w:t>
             </w:r>
           </w:p>
         </w:tc>
@@ -11488,14 +11400,14 @@
           <w:color w:val="2B2B36"/>
           <w:sz w:val="20"/>
         </w:rPr>
-        <w:t xml:space="preserve"> Hero headline, sub-line and Contact us, plus the mega menu with utility actions</w:t>
+        <w:t xml:space="preserve"> Video banner with headline over it, and the menu with Contact highlighted</w:t>
       </w:r>
       <w:r>
         <w:rPr>
           <w:color w:val="8A8FA3"/>
           <w:sz w:val="16"/>
         </w:rPr>
-        <w:t xml:space="preserve">  [D]</w:t>
+        <w:t xml:space="preserve">  [T 22:33] [T 24:51]</w:t>
       </w:r>
     </w:p>
     <w:tbl>
@@ -18264,22 +18176,14 @@
                 <w:color w:val="2B2B36"/>
                 <w:sz w:val="20"/>
               </w:rPr>
-              <w:t>Quoted: DEFT (Macquarie) outbound link, EDM (Mailchimp, Campaign Monitor or equivalent, which one not known), LinkedIn feed. Client raised Stripe on 21/07 as Macquarie may change</w:t>
-            </w:r>
-            <w:r>
-              <w:rPr>
-                <w:b/>
-                <w:color w:val="C0392B"/>
-                <w:sz w:val="20"/>
-              </w:rPr>
-              <w:t xml:space="preserve"> TBC: questionnaire Part B QB1, QB6. Contested: Quote: outbound link to DEFT (Macquarie), no gateway [E,H]. Client on 21/07: Macquarie may change, Stripe 'back on the table' [T 26:24]. Mia said devs would integrate it [T 27:16]. A Stripe integration is not quoted.</w:t>
+              <w:t>DEFT card portal scrapped. No direct card payment: card payers use partner Arteva Pay; bank transfer via Macquarie continues. Pay an Invoice becomes a link to Arteva Pay and transfer details. Forms currently on Jotform; the new site moves to Gravity Forms as quoted. EDM: none yet, client will pick one.</w:t>
             </w:r>
             <w:r>
               <w:rPr>
                 <w:color w:val="8A8FA3"/>
                 <w:sz w:val="16"/>
               </w:rPr>
-              <w:t xml:space="preserve">  [E] [T 26:24]</w:t>
+              <w:t xml:space="preserve">  [QB1] [QB6] [T 34:14] [E]</w:t>
             </w:r>
           </w:p>
         </w:tc>
@@ -18370,7 +18274,7 @@
                 <w:color w:val="2B2B36"/>
                 <w:sz w:val="20"/>
               </w:rPr>
-              <w:t>General enquiry with a subject dropdown for inbox filtering; "review my policy" form dropped; claim and workplace injury forms with PDF upload stay. Which inbox each subject goes to is not known</w:t>
+              <w:t>Six forms. General enquiry, Request a quote, Insurance program review (optional upload): to camerong@, alexr@ and communications@. Lodge a claim (uploads): to the staff member picked in a dropdown, plus teambrett@ and teamalex@ if "not sure". Workplace injury (uploads): picked staff member, injury.management@, eoss@rtozerconsulting.com.au and nick@praventus.com.au. Commission Consent Declaration (signature): picked staff member and communications@. Uploads: PDF, JPG/PNG, Word, large files such as video. Marketing consent on the contact form. Client asked whether claim and injury could merge into one branching form; keep separate if simpler.</w:t>
             </w:r>
             <w:r>
               <w:rPr>
@@ -18378,14 +18282,14 @@
                 <w:color w:val="C0392B"/>
                 <w:sz w:val="20"/>
               </w:rPr>
-              <w:t xml:space="preserve"> TBC: questionnaire Part B QB2, QB3, QB4</w:t>
+              <w:t xml:space="preserve"> TBC: internal, Gabe with Raf: signature, branching and the 6th form against the quote. Contested: Quote names 5 forms; Commission Consent Declaration with a signature is a 6th. Branching merge not quoted.</w:t>
             </w:r>
             <w:r>
               <w:rPr>
                 <w:color w:val="8A8FA3"/>
                 <w:sz w:val="16"/>
               </w:rPr>
-              <w:t xml:space="preserve">  [T 15:57] [T 16:55]</w:t>
+              <w:t xml:space="preserve">  [QB2] [QB4] [T 15:17] [T 18:38] [Q9]</w:t>
             </w:r>
           </w:p>
         </w:tc>
@@ -18471,14 +18375,14 @@
                 <w:color w:val="2B2B36"/>
                 <w:sz w:val="20"/>
               </w:rPr>
-              <w:t>No WCAG target: audit and remediation are out of scope. Build to sensible defaults</w:t>
+              <w:t>No WCAG target. Client has little accessibility experience and is "happy to be guided"; audit and remediation are out of scope, so build to sensible defaults.</w:t>
             </w:r>
             <w:r>
               <w:rPr>
                 <w:color w:val="8A8FA3"/>
                 <w:sz w:val="16"/>
               </w:rPr>
-              <w:t xml:space="preserve">  [E] [P]</w:t>
+              <w:t xml:space="preserve">  [T 24:51] [E] [P]</w:t>
             </w:r>
           </w:p>
         </w:tc>
@@ -18564,22 +18468,14 @@
                 <w:color w:val="2B2B36"/>
                 <w:sz w:val="20"/>
               </w:rPr>
-              <w:t>Fast load is one of the client's main aims; avoid graphic-heavy pages</w:t>
-            </w:r>
-            <w:r>
-              <w:rPr>
-                <w:b/>
-                <w:color w:val="C0392B"/>
-                <w:sz w:val="20"/>
-              </w:rPr>
-              <w:t xml:space="preserve"> TBC: ask at kick-off</w:t>
+              <w:t>Fast loading is a must, forms especially: the current forms take seconds to load and lose people. The hero video must not slow the page.</w:t>
             </w:r>
             <w:r>
               <w:rPr>
                 <w:color w:val="8A8FA3"/>
                 <w:sz w:val="16"/>
               </w:rPr>
-              <w:t xml:space="preserve">  [T 10:23]</w:t>
+              <w:t xml:space="preserve">  [T 15:17] [Q9] [Q7]</w:t>
             </w:r>
           </w:p>
         </w:tc>
@@ -18665,7 +18561,7 @@
                 <w:color w:val="2B2B36"/>
                 <w:sz w:val="20"/>
               </w:rPr>
-              <w:t>Keep permalinks and rankings, 301s, GA4 and GTM retained, schema, separate the brand from WTW in search. Access to GA4, GTM and Search Console not confirmed</w:t>
+              <w:t>Keep permalinks and rankings with 301s; retain GA4 and GTM; schema. Access to GA4, GTM, Search Console, domain and RocketSpark not returned in QB5. Domain managed by their IT.</w:t>
             </w:r>
             <w:r>
               <w:rPr>
@@ -18673,14 +18569,14 @@
                 <w:color w:val="C0392B"/>
                 <w:sz w:val="20"/>
               </w:rPr>
-              <w:t xml:space="preserve"> TBC: questionnaire Part B QB5</w:t>
+              <w:t xml:space="preserve"> TBC: questionnaire Part B</w:t>
             </w:r>
             <w:r>
               <w:rPr>
                 <w:color w:val="8A8FA3"/>
                 <w:sz w:val="16"/>
               </w:rPr>
-              <w:t xml:space="preserve">  [E] [H]</w:t>
+              <w:t xml:space="preserve">  [E] [H] [Q11]</w:t>
             </w:r>
           </w:p>
         </w:tc>
@@ -19113,22 +19009,14 @@
                 <w:color w:val="2B2B36"/>
                 <w:sz w:val="20"/>
               </w:rPr>
-              <w:t>About four fifths drafted on 21/07, then to be checked by their team. Current status not known</w:t>
-            </w:r>
-            <w:r>
-              <w:rPr>
-                <w:b/>
-                <w:color w:val="C0392B"/>
-                <w:sz w:val="20"/>
-              </w:rPr>
-              <w:t xml:space="preserve"> TBC: questionnaire Part A Q3</w:t>
+              <w:t>About 90 pages written for the new sitemap, nearly all rewritten. In draft, waiting on internal team review, which has held things up for 2 months. Client will upload the drafts to the project folder now, for character counts and context only.</w:t>
             </w:r>
             <w:r>
               <w:rPr>
                 <w:color w:val="8A8FA3"/>
                 <w:sz w:val="16"/>
               </w:rPr>
-              <w:t xml:space="preserve">  [T 04:45]</w:t>
+              <w:t xml:space="preserve">  [T 09:02] [T 19:59] [T 32:20]</w:t>
             </w:r>
           </w:p>
         </w:tc>
@@ -19307,22 +19195,14 @@
                 <w:color w:val="2B2B36"/>
                 <w:sz w:val="20"/>
               </w:rPr>
-              <w:t>Content was due by development, "about 6 weeks" after 21/07. No firm date was set</w:t>
-            </w:r>
-            <w:r>
-              <w:rPr>
-                <w:b/>
-                <w:color w:val="C0392B"/>
-                <w:sz w:val="20"/>
-              </w:rPr>
-              <w:t xml:space="preserve"> TBC: questionnaire Part A Q4</w:t>
+              <w:t>Not for internals. Client expects the team to review copy in November and December, when work slows down. Design proceeds on the draft text.</w:t>
             </w:r>
             <w:r>
               <w:rPr>
                 <w:color w:val="8A8FA3"/>
                 <w:sz w:val="16"/>
               </w:rPr>
-              <w:t xml:space="preserve">  [T 29:14]</w:t>
+              <w:t xml:space="preserve">  [T 10:00]</w:t>
             </w:r>
           </w:p>
         </w:tc>
@@ -20042,22 +19922,14 @@
                 <w:color w:val="2B2B36"/>
                 <w:sz w:val="20"/>
               </w:rPr>
-              <w:t>FSG and Terms of Business, Insurance Brokers Code of Practice, Privacy Policy, Disclaimer, Complaints, Vulnerable Client and Financial Hardship policy, AFSL footer</w:t>
-            </w:r>
-            <w:r>
-              <w:rPr>
-                <w:b/>
-                <w:color w:val="C0392B"/>
-                <w:sz w:val="20"/>
-              </w:rPr>
-              <w:t xml:space="preserve"> TBC: content stage</w:t>
+              <w:t>Downloadable PDFs (FSG, vulnerable clients policy) on one Financial Services page with download buttons. Privacy policy in the footer needs a formal review; Gabe said PWD would supply a standard template and advised legal review. AFSL details and compliance documents in the footer.</w:t>
             </w:r>
             <w:r>
               <w:rPr>
                 <w:color w:val="8A8FA3"/>
                 <w:sz w:val="16"/>
               </w:rPr>
-              <w:t xml:space="preserve">  [E] [H] [D]</w:t>
+              <w:t xml:space="preserve">  [T 38:28] [T 39:40] [T 40:35] [Q9]</w:t>
             </w:r>
           </w:p>
         </w:tc>
@@ -22804,7 +22676,7 @@
                 <w:color w:val="2B2B36"/>
                 <w:sz w:val="20"/>
               </w:rPr>
-              <w:t>26 open: internal 8, kick-off meeting 6, questionnaire Part A 6, questionnaire Part B 4, content stage 3, PWD 2</w:t>
+              <w:t>18 open: internal 10, kick-off meeting 3, questionnaire Part B 2, questionnaire Part A 1, content stage 2, PWD 2</w:t>
             </w:r>
           </w:p>
         </w:tc>
@@ -23304,11 +23176,10 @@
             </w:pPr>
             <w:r>
               <w:rPr>
-                <w:b/>
-                <w:color w:val="C0392B"/>
-                <w:sz w:val="20"/>
-              </w:rPr>
-              <w:t>Open</w:t>
+                <w:color w:val="2B2B36"/>
+                <w:sz w:val="20"/>
+              </w:rPr>
+              <w:t>Pass</w:t>
             </w:r>
           </w:p>
         </w:tc>
@@ -23372,7 +23243,7 @@
                 <w:color w:val="2B2B36"/>
                 <w:sz w:val="20"/>
               </w:rPr>
-              <w:t>4 secondary actions</w:t>
+              <w:t>2 secondary actions</w:t>
             </w:r>
           </w:p>
         </w:tc>
@@ -24080,7 +23951,7 @@
                 <w:color w:val="2B2B36"/>
                 <w:sz w:val="20"/>
               </w:rPr>
-              <w:t>DRAFT. Mia committed to send it for approval after 21/07; no approval date recorded</w:t>
+              <w:t>DRAFT. Sitemap V1 (PWD) shown at kick-off. Client has its own copy of an earlier PWD sitemap with comments and further changes discussed with Eleanor, and will email it. Not approved.</w:t>
             </w:r>
           </w:p>
         </w:tc>

</xml_diff>